<commit_message>
feat(ppc-adm): adequações ao retorno do CEPE/DIREN, ementas de Libras, Quadro 6A e recompilação dos PDFs
</commit_message>
<xml_diff>
--- a/tecnico-administracao/form-alteracao-ppc-adm/formulario-alteracao-ppc-adm-PPC_23-07-18.docx
+++ b/tecnico-administracao/form-alteracao-ppc-adm/formulario-alteracao-ppc-adm-PPC_23-07-18.docx
@@ -72,8 +72,8 @@
           <w:szCs w:val="28"/>
         </w:rPr>
         <w:sectPr>
-          <w:headerReference r:id="rId6" w:type="default"/>
-          <w:footerReference r:id="rId7" w:type="default"/>
+          <w:headerReference r:id="rId7" w:type="default"/>
+          <w:footerReference r:id="rId8" w:type="default"/>
           <w:pgSz w:h="16838" w:w="11906" w:orient="portrait"/>
           <w:pgMar w:bottom="2038" w:top="1693" w:left="1134" w:right="1134" w:header="1134" w:footer="1134"/>
           <w:pgNumType w:start="1"/>
@@ -116,11 +116,19 @@
       </w:r>
       <w:r>
         <w:rPr>
-          <w:rFonts w:ascii="Arial" w:hAnsi="Arial"/>
+          <w:rFonts w:ascii="Arial" w:cs="Arial" w:eastAsia="Arial" w:hAnsi="Arial"/>
           <w:b w:val="0"/>
+          <w:bCs w:val="0"/>
           <w:sz w:val="22"/>
-        </w:rPr>
-        <w:t>Garopaba</w:t>
+          <w:szCs w:val="22"/>
+          <w:rtl w:val="0"/>
+        </w:rPr>
+        <w:t xml:space="preserve">Garopaba</w:t>
+      </w:r>
+      <w:r>
+        <w:rPr>
+          <w:rtl w:val="0"/>
+        </w:rPr>
       </w:r>
     </w:p>
     <w:p>
@@ -150,11 +158,19 @@
       </w:r>
       <w:r>
         <w:rPr>
-          <w:rFonts w:ascii="Arial" w:hAnsi="Arial"/>
+          <w:rFonts w:ascii="Arial" w:cs="Arial" w:eastAsia="Arial" w:hAnsi="Arial"/>
           <w:b w:val="0"/>
+          <w:bCs w:val="0"/>
           <w:sz w:val="22"/>
-        </w:rPr>
-        <w:t>Departamento de Ensino, Pesquisa e Extensão (DEPE)</w:t>
+          <w:szCs w:val="22"/>
+          <w:rtl w:val="0"/>
+        </w:rPr>
+        <w:t xml:space="preserve">Departamento de Ensino, Pesquisa e Extensão (DEPE)</w:t>
+      </w:r>
+      <w:r>
+        <w:rPr>
+          <w:rtl w:val="0"/>
+        </w:rPr>
       </w:r>
     </w:p>
     <w:p>
@@ -179,11 +195,19 @@
       </w:r>
       <w:r>
         <w:rPr>
-          <w:rFonts w:ascii="Arial" w:hAnsi="Arial"/>
+          <w:rFonts w:ascii="Arial" w:cs="Arial" w:eastAsia="Arial" w:hAnsi="Arial"/>
           <w:b w:val="0"/>
+          <w:bCs w:val="0"/>
           <w:sz w:val="22"/>
-        </w:rPr>
-        <w:t>(48) 3254-7336 | depe.gpa@ifsc.edu.br | direcao.gpa@ifsc.edu.br</w:t>
+          <w:szCs w:val="22"/>
+          <w:rtl w:val="0"/>
+        </w:rPr>
+        <w:t xml:space="preserve">(48) 3254-7336 | depe.gpa@ifsc.edu.br | direcao.gpa@ifsc.edu.br</w:t>
+      </w:r>
+      <w:r>
+        <w:rPr>
+          <w:rtl w:val="0"/>
+        </w:rPr>
       </w:r>
     </w:p>
     <w:p>
@@ -305,11 +329,19 @@
       </w:r>
       <w:r>
         <w:rPr>
-          <w:rFonts w:ascii="Arial" w:hAnsi="Arial"/>
+          <w:rFonts w:ascii="Arial" w:cs="Arial" w:eastAsia="Arial" w:hAnsi="Arial"/>
           <w:b w:val="0"/>
+          <w:bCs w:val="0"/>
           <w:sz w:val="22"/>
-        </w:rPr>
-        <w:t>Curso Técnico em Administração Integrado ao Ensino Médio</w:t>
+          <w:szCs w:val="22"/>
+          <w:rtl w:val="0"/>
+        </w:rPr>
+        <w:t xml:space="preserve">Curso Técnico em Administração Integrado ao Ensino Médio</w:t>
+      </w:r>
+      <w:r>
+        <w:rPr>
+          <w:rtl w:val="0"/>
+        </w:rPr>
       </w:r>
     </w:p>
     <w:p>
@@ -390,11 +422,19 @@
       </w:r>
       <w:r>
         <w:rPr>
-          <w:rFonts w:ascii="Arial" w:hAnsi="Arial"/>
+          <w:rFonts w:ascii="Arial" w:cs="Arial" w:eastAsia="Arial" w:hAnsi="Arial"/>
           <w:b w:val="0"/>
+          <w:bCs w:val="0"/>
           <w:sz w:val="22"/>
-        </w:rPr>
-        <w:t>Resolução CEPE nº 042/2016 (Criação/Autorização) | Resolução CONSUP/IFSC nº 142/2025 (Diretrizes de Reformulação)</w:t>
+          <w:szCs w:val="22"/>
+          <w:rtl w:val="0"/>
+        </w:rPr>
+        <w:t xml:space="preserve">Resolução CEPE nº 042/2016 (Criação/Autorização) | Resolução CONSUP/IFSC nº 142/2025 (Diretrizes de Reformulação)</w:t>
+      </w:r>
+      <w:r>
+        <w:rPr>
+          <w:rtl w:val="0"/>
+        </w:rPr>
       </w:r>
     </w:p>
     <w:p>
@@ -424,11 +464,19 @@
       </w:r>
       <w:r>
         <w:rPr>
-          <w:rFonts w:ascii="Arial" w:hAnsi="Arial"/>
+          <w:rFonts w:ascii="Arial" w:cs="Arial" w:eastAsia="Arial" w:hAnsi="Arial"/>
           <w:b w:val="0"/>
+          <w:bCs w:val="0"/>
           <w:sz w:val="22"/>
-        </w:rPr>
-        <w:t>Presencial Integrada ao Ensino Médio (Turno Matutino, 40 vagas de ingresso anual, 6 semestres / 3 anos)</w:t>
+          <w:szCs w:val="22"/>
+          <w:rtl w:val="0"/>
+        </w:rPr>
+        <w:t xml:space="preserve">Presencial Integrada ao Ensino Médio (Turno Matutino, 40 vagas de ingresso anual, 6 semestres / 3 anos)</w:t>
+      </w:r>
+      <w:r>
+        <w:rPr>
+          <w:rtl w:val="0"/>
+        </w:rPr>
       </w:r>
     </w:p>
     <w:p>
@@ -587,7 +635,7 @@
       <w:tr>
         <w:trPr>
           <w:cantSplit w:val="0"/>
-          <w:trHeight w:val="1047" w:hRule="atLeast"/>
+          <w:trHeight w:val="1966.8652343750002" w:hRule="atLeast"/>
           <w:tblHeader w:val="0"/>
         </w:trPr>
         <w:tc>
@@ -602,179 +650,49 @@
           </w:tcPr>
           <w:p>
             <w:pPr>
-              <w:spacing w:before="60" w:after="80" w:line="276" w:lineRule="auto"/>
-              <w:jc w:val="both"/>
+              <w:widowControl w:val="1"/>
+              <w:spacing w:after="240" w:before="240" w:line="276" w:lineRule="auto"/>
+              <w:rPr>
+                <w:rFonts w:ascii="Arial" w:cs="Arial" w:eastAsia="Arial" w:hAnsi="Arial"/>
+                <w:sz w:val="20"/>
+                <w:szCs w:val="20"/>
+              </w:rPr>
             </w:pPr>
-            <w:r/>
             <w:r>
               <w:rPr>
-                <w:rFonts w:ascii="Arial" w:hAnsi="Arial"/>
-                <w:b/>
+                <w:rFonts w:ascii="Arial" w:cs="Arial" w:eastAsia="Arial" w:hAnsi="Arial"/>
                 <w:sz w:val="20"/>
-              </w:rPr>
-              <w:t xml:space="preserve">1. Seção IV – Carga Horária Total e Integralização Curricular: </w:t>
-            </w:r>
-            <w:r>
-              <w:rPr>
-                <w:rFonts w:ascii="Arial" w:hAnsi="Arial"/>
-                <w:b w:val="0"/>
-                <w:sz w:val="20"/>
-              </w:rPr>
-              <w:t>Ajuste e harmonização da carga horária global em 3.120 horas (3.040 horas presenciais e 80 horas a distância amparadas pedagogicamente), assegurando plenamente o piso da Formação Geral Básica do IFSC (2.120h) e o mínimo do Catálogo Nacional de Cursos Técnicos (CNCT/MEC - 1.000h para o eixo de Gestão e Negócios).</w:t>
+                <w:szCs w:val="20"/>
+                <w:rtl w:val="0"/>
+              </w:rPr>
+              <w:t xml:space="preserve">Adaptação do Projeto Pedagógico de Curso  para o novo modelo de curso técnico disponibilizado pela Comissão de Ensino, Pesquisa e Extensão (CEPE).</w:t>
             </w:r>
           </w:p>
           <w:p>
             <w:pPr>
-              <w:spacing w:before="60" w:after="80" w:line="276" w:lineRule="auto"/>
-              <w:jc w:val="both"/>
+              <w:widowControl w:val="1"/>
+              <w:spacing w:after="240" w:before="240" w:line="276" w:lineRule="auto"/>
+              <w:rPr>
+                <w:rFonts w:ascii="Arial" w:cs="Arial" w:eastAsia="Arial" w:hAnsi="Arial"/>
+                <w:b w:val="1"/>
+                <w:bCs w:val="1"/>
+                <w:sz w:val="20"/>
+                <w:szCs w:val="20"/>
+              </w:rPr>
             </w:pPr>
             <w:r>
               <w:rPr>
-                <w:rFonts w:ascii="Arial" w:hAnsi="Arial"/>
-                <w:b/>
+                <w:rFonts w:ascii="Arial" w:cs="Arial" w:eastAsia="Arial" w:hAnsi="Arial"/>
                 <w:sz w:val="20"/>
-              </w:rPr>
-              <w:t xml:space="preserve">2. Seção IV – Marco Legal, Normativas Institucionais e Cidadania Digital: </w:t>
+                <w:szCs w:val="20"/>
+                <w:rtl w:val="0"/>
+              </w:rPr>
+              <w:t xml:space="preserve">Alteração da matriz curricular do Curso Técnico Integrado em Administração, com alteração na organização, nomenclatura, carga horária e distribuição das unidades curriculares (UC) da Formação Geral, da Formação Técnica e Profissional e do Núcleo Politécnico Comum.</w:t>
             </w:r>
             <w:r>
               <w:rPr>
-                <w:rFonts w:ascii="Arial" w:hAnsi="Arial"/>
-                <w:b w:val="0"/>
-                <w:sz w:val="20"/>
-              </w:rPr>
-              <w:t>Alinhamento integral à Resolução CONSUP/IFSC nº 142/2025, ao Regulamento Didático-Pedagógico (RDP 2021) e às DCNs de EPT; Inclusão formal do Subitem 10.6 dedicado à Proteção de Dados, Segurança da Informação e Cidadania Digital (Lei nº 13.709/2018 - LGPD e Marco Civil da Internet).</w:t>
-            </w:r>
-          </w:p>
-          <w:p>
-            <w:pPr>
-              <w:spacing w:before="60" w:after="80" w:line="276" w:lineRule="auto"/>
-              <w:jc w:val="both"/>
-            </w:pPr>
-            <w:r>
-              <w:rPr>
-                <w:rFonts w:ascii="Arial" w:hAnsi="Arial"/>
-                <w:b/>
-                <w:sz w:val="20"/>
-              </w:rPr>
-              <w:t xml:space="preserve">3. Seção IV – Perfil Profissional de Conclusão / Perfil do Egresso: </w:t>
-            </w:r>
-            <w:r>
-              <w:rPr>
-                <w:rFonts w:ascii="Arial" w:hAnsi="Arial"/>
-                <w:b w:val="0"/>
-                <w:sz w:val="20"/>
-              </w:rPr>
-              <w:t>Reestruturação das competências profissionais e gerais, priorizando a formação cidadã crítica, o raciocínio analítico para tomada de decisões, trabalho colaborativo, fluência em ferramentas de gestão e compromisso com o desenvolvimento socioeconômico sustentável regional.</w:t>
-            </w:r>
-          </w:p>
-          <w:p>
-            <w:pPr>
-              <w:spacing w:before="60" w:after="80" w:line="276" w:lineRule="auto"/>
-              <w:jc w:val="both"/>
-            </w:pPr>
-            <w:r>
-              <w:rPr>
-                <w:rFonts w:ascii="Arial" w:hAnsi="Arial"/>
-                <w:b/>
-                <w:sz w:val="20"/>
-              </w:rPr>
-              <w:t xml:space="preserve">4. Seção V – Matriz Curricular e Organização dos Três Anos Letivos: </w:t>
-            </w:r>
-            <w:r>
-              <w:rPr>
-                <w:rFonts w:ascii="Arial" w:hAnsi="Arial"/>
-                <w:b w:val="0"/>
-                <w:sz w:val="20"/>
-              </w:rPr>
-              <w:t>Sanitização pedagógica do Ensino Médio Integrado: superação de fragmentações da reforma do ensino médio e remoção da terminologia segregada "BNCC"; implantação das unidades de Oficina de Integração I (80h - 2º ano) e Oficina de Integração II (80h - 3º ano); garantia da formação plurilíngue integrada (120h de Língua Espanhola e 120h de Língua Inglesa).</w:t>
-            </w:r>
-          </w:p>
-          <w:p>
-            <w:pPr>
-              <w:spacing w:before="60" w:after="80" w:line="276" w:lineRule="auto"/>
-              <w:jc w:val="both"/>
-            </w:pPr>
-            <w:r>
-              <w:rPr>
-                <w:rFonts w:ascii="Arial" w:hAnsi="Arial"/>
-                <w:b/>
-                <w:sz w:val="20"/>
-              </w:rPr>
-              <w:t xml:space="preserve">5. Seção V – Ementário, Metodologias Ativas e Bibliografias das 45 Unidades Curriculares: </w:t>
-            </w:r>
-            <w:r>
-              <w:rPr>
-                <w:rFonts w:ascii="Arial" w:hAnsi="Arial"/>
-                <w:b w:val="0"/>
-                <w:sz w:val="20"/>
-              </w:rPr>
-              <w:t>Padronização dos conteúdos programáticos em tópicos objetivos; explicitação de estratégias de metodologias ativas (Aprendizagem Baseada em Problemas - PBL, Estudos de Caso e Simulações Gerenciais); saneamento integral de 284 referências bibliográficas pela ABNT NBR 6023:2025, priorizando títulos disponíveis no acervo do Câmpus e nas plataformas digitais institucionais (Minha Biblioteca e Pearson).</w:t>
-            </w:r>
-          </w:p>
-          <w:p>
-            <w:pPr>
-              <w:spacing w:before="60" w:after="80" w:line="276" w:lineRule="auto"/>
-              <w:jc w:val="both"/>
-            </w:pPr>
-            <w:r>
-              <w:rPr>
-                <w:rFonts w:ascii="Arial" w:hAnsi="Arial"/>
-                <w:b/>
-                <w:sz w:val="20"/>
-              </w:rPr>
-              <w:t xml:space="preserve">6. Seção VII – Infraestrutura Didática e Ambientes Práticos de Formação: </w:t>
-            </w:r>
-            <w:r>
-              <w:rPr>
-                <w:rFonts w:ascii="Arial" w:hAnsi="Arial"/>
-                <w:b w:val="0"/>
-                <w:sz w:val="20"/>
-              </w:rPr>
-              <w:t>Inclusão formal no catálogo de ambientes do Laboratório de Inovação, Empreendedorismo e Desenvolvimento Sustentável (LINEDS) (Sala B101) como espaço maker/incubador para práticas de gestão e simulação de negócios reais.</w:t>
-            </w:r>
-          </w:p>
-          <w:p>
-            <w:pPr>
-              <w:spacing w:before="60" w:after="80" w:line="276" w:lineRule="auto"/>
-              <w:jc w:val="both"/>
-            </w:pPr>
-            <w:r>
-              <w:rPr>
-                <w:rFonts w:ascii="Arial" w:hAnsi="Arial"/>
-                <w:b/>
-                <w:sz w:val="20"/>
-              </w:rPr>
-              <w:t xml:space="preserve">7. Seção VIII – Corpo Docente e Técnico-Administrativo: </w:t>
-            </w:r>
-            <w:r>
-              <w:rPr>
-                <w:rFonts w:ascii="Arial" w:hAnsi="Arial"/>
-                <w:b w:val="0"/>
-                <w:sz w:val="20"/>
-              </w:rPr>
-              <w:t>Atualização quantitativa e qualitativa do corpo docente para 37 professores efetivos em Regime de Dedicação Exclusiva (RDE, com ampla maioria de mestres e doutores) e 17 servidores técnico-administrativos.</w:t>
-            </w:r>
-          </w:p>
-          <w:p>
-            <w:pPr>
-              <w:spacing w:before="60" w:after="80" w:line="276" w:lineRule="auto"/>
-              <w:jc w:val="both"/>
-            </w:pPr>
-            <w:r>
-              <w:rPr>
-                <w:rFonts w:ascii="Arial" w:hAnsi="Arial"/>
-                <w:b/>
-                <w:sz w:val="20"/>
-              </w:rPr>
-              <w:t xml:space="preserve">8. Seção IX – Mecanismos de Permanência, Inclusão e Avaliação da Aprendizagem: </w:t>
-            </w:r>
-            <w:r>
-              <w:rPr>
-                <w:rFonts w:ascii="Arial" w:hAnsi="Arial"/>
-                <w:b w:val="0"/>
-                <w:sz w:val="20"/>
-              </w:rPr>
-              <w:t>Fortalecimento da articulação pedagógica com o NAPNE, NEABI e Assistência Estudantil (PAE); consolidação da avaliação contínua, formativa e diagnóstica com recuperação paralela mandatória nos termos do RDP.</w:t>
+                <w:rtl w:val="0"/>
+              </w:rPr>
             </w:r>
           </w:p>
         </w:tc>
@@ -954,141 +872,273 @@
           </w:tcPr>
           <w:p>
             <w:pPr>
-              <w:spacing w:before="80" w:after="80" w:line="276" w:lineRule="auto"/>
+              <w:spacing w:after="80" w:before="80" w:line="276" w:lineRule="auto"/>
               <w:jc w:val="both"/>
+              <w:rPr>
+                <w:sz w:val="22"/>
+                <w:szCs w:val="22"/>
+              </w:rPr>
             </w:pPr>
-            <w:r/>
             <w:r>
               <w:rPr>
-                <w:rFonts w:ascii="Arial" w:hAnsi="Arial"/>
-                <w:b/>
-                <w:sz w:val="21"/>
-              </w:rPr>
-              <w:t>Contextualização e Finalidade da Reformulação</w:t>
-              <w:br/>
+                <w:rFonts w:ascii="Arial" w:cs="Arial" w:eastAsia="Arial" w:hAnsi="Arial"/>
+                <w:b w:val="1"/>
+                <w:bCs w:val="1"/>
+                <w:sz w:val="22"/>
+                <w:szCs w:val="22"/>
+                <w:rtl w:val="0"/>
+              </w:rPr>
+              <w:t xml:space="preserve">Contextualização e Finalidade da Reformulação</w:t>
+              <w:br w:type="textWrapping"/>
             </w:r>
             <w:r>
               <w:rPr>
-                <w:rFonts w:ascii="Arial" w:hAnsi="Arial"/>
-                <w:b w:val="0"/>
-                <w:sz w:val="20"/>
-              </w:rPr>
-              <w:t>A presente proposta de alteração do Projeto Pedagógico do Curso Técnico em Administração Integrado ao Ensino Médio do IFSC Câmpus Garopaba decorre dos trabalhos da Comissão de Revisão e Reformulação instituída pela Portaria DG nº 186/2026 (que alterou a Portaria DG nº 156/2026). A reformulação tem como finalidade central atualizar a proposta pedagógica e curricular do curso às novas diretrizes institucionais emanadas pelo Conselho Superior do IFSC e às profundas transformações socioeconômicas e produtivas do mundo do trabalho contemporâneo.</w:t>
+                <w:rFonts w:ascii="Arial" w:cs="Arial" w:eastAsia="Arial" w:hAnsi="Arial"/>
+                <w:sz w:val="22"/>
+                <w:szCs w:val="22"/>
+                <w:rtl w:val="0"/>
+              </w:rPr>
+              <w:t xml:space="preserve">A presente proposta de alteração do Projeto Pedagógico do Curso Técnico em Administração Integrado ao Ensino Médio do IFSC Câmpus Garopaba decorre dos trabalhos da Comissão de Revisão e Reformulação instituída pela Portaria DG nº 186/2026 (que alterou a Portaria DG nº 156/2026). A reformulação tem como finalidade central atualizar a proposta pedagógica e curricular do curso às novas diretrizes institucionais emanadas pelo Conselho Superior do IFSC e às profundas transformações socioeconômicas e produtivas do mundo do trabalho contemporâneo.</w:t>
+            </w:r>
+            <w:r>
+              <w:rPr>
+                <w:rtl w:val="0"/>
+              </w:rPr>
             </w:r>
           </w:p>
           <w:p>
             <w:pPr>
-              <w:spacing w:before="80" w:after="80" w:line="276" w:lineRule="auto"/>
+              <w:spacing w:after="80" w:before="80" w:line="276" w:lineRule="auto"/>
               <w:jc w:val="both"/>
+              <w:rPr>
+                <w:rFonts w:ascii="Arial" w:cs="Arial" w:eastAsia="Arial" w:hAnsi="Arial"/>
+                <w:b w:val="1"/>
+                <w:bCs w:val="1"/>
+                <w:sz w:val="22"/>
+                <w:szCs w:val="22"/>
+              </w:rPr>
             </w:pPr>
             <w:r>
               <w:rPr>
-                <w:rFonts w:ascii="Arial" w:hAnsi="Arial"/>
-                <w:b/>
-                <w:sz w:val="21"/>
-              </w:rPr>
-              <w:t>1. Alinhamento Institucional e Razoabilidade da Carga Horária</w:t>
-              <w:br/>
-            </w:r>
-            <w:r>
-              <w:rPr>
-                <w:rFonts w:ascii="Arial" w:hAnsi="Arial"/>
-                <w:b w:val="0"/>
-                <w:sz w:val="20"/>
-              </w:rPr>
-              <w:t>A reformulação cumpre com rigor técnico a Resolução CONSUP/IFSC nº 142, de 16 de dezembro de 2025, que fixou as novas diretrizes institucionais para a oferta dos Cursos Técnicos Integrados ao Ensino Médio na Rede IFSC. A matriz curricular foi harmonizada em uma Carga Horária Total de 3.120 horas (com 3.040 horas presenciais e 80 horas de atividades a distância amparadas pedagogicamente), distribuídas equilibradamente ao longo de três anos letivos: 1.040 horas no 1º ano, 1.200 horas no 2º ano e 880 horas no 3º ano. Esta organização elimina a sobrecarga pedagógica excessiva diária para os discentes adolescentes, assegurando o cumprimento estrito tanto do piso de 2.120 horas da Formação Geral Básica quanto das 1.000 horas de Formação Profissional Técnica exigidas pelo Catálogo Nacional de Cursos Técnicos (CNCT/MEC para o eixo de Gestão e Negócios). Ademais, o documento incorpora o alinhamento pleno às normas do Regulamento Didático-Pedagógico (RDP - Resolução CONSUP nº 23/2021).</w:t>
+                <w:rtl w:val="0"/>
+              </w:rPr>
             </w:r>
           </w:p>
           <w:p>
             <w:pPr>
-              <w:spacing w:before="80" w:after="80" w:line="276" w:lineRule="auto"/>
+              <w:spacing w:after="80" w:before="80" w:line="276" w:lineRule="auto"/>
               <w:jc w:val="both"/>
+              <w:rPr>
+                <w:rFonts w:ascii="Arial" w:cs="Arial" w:eastAsia="Arial" w:hAnsi="Arial"/>
+                <w:b w:val="1"/>
+                <w:bCs w:val="1"/>
+                <w:sz w:val="22"/>
+                <w:szCs w:val="22"/>
+              </w:rPr>
             </w:pPr>
             <w:r>
               <w:rPr>
-                <w:rFonts w:ascii="Arial" w:hAnsi="Arial"/>
-                <w:b/>
-                <w:sz w:val="21"/>
-              </w:rPr>
-              <w:t>2. Concepção Pedagógica: Formação Humana Integral e Politecnia</w:t>
-              <w:br/>
+                <w:rFonts w:ascii="Arial" w:cs="Arial" w:eastAsia="Arial" w:hAnsi="Arial"/>
+                <w:b w:val="1"/>
+                <w:bCs w:val="1"/>
+                <w:sz w:val="22"/>
+                <w:szCs w:val="22"/>
+                <w:rtl w:val="0"/>
+              </w:rPr>
+              <w:br w:type="textWrapping"/>
             </w:r>
             <w:r>
               <w:rPr>
-                <w:rFonts w:ascii="Arial" w:hAnsi="Arial"/>
-                <w:b w:val="0"/>
-                <w:sz w:val="20"/>
-              </w:rPr>
-              <w:t>O projeto reafirma categoricamente a concepção de Formação Humana Integral e a Politecnia, fundamentada nos pilares da Pedagogia Histórico-Crítica (Dermeval Saviani). Rejeita-se qualquer fragmentação tecnicista ou empobrecimento da base científica e humanística, articulando trabalho, ciência, cultura e tecnologia como princípios indissociáveis. A integração curricular efetiva-se através da metodologia de Ciclos Temáticos e pela introdução das unidades curriculares basilares de Oficina de Integração I (80h no 2º ano) e Oficina de Integração II (80h no 3º ano). Nessas oficinas interdisciplinares, os estudantes desenvolvem projetos de intervenção socioprodutiva baseados em problemas reais do ecossistema regional de Garopaba e do Litoral Sul catarinense, consolidando a práxis entre teoria e prática.</w:t>
+                <w:rFonts w:ascii="Arial" w:cs="Arial" w:eastAsia="Arial" w:hAnsi="Arial"/>
+                <w:b w:val="1"/>
+                <w:bCs w:val="1"/>
+                <w:sz w:val="22"/>
+                <w:szCs w:val="22"/>
+                <w:rtl w:val="0"/>
+              </w:rPr>
+              <w:t xml:space="preserve">Inclusão de novas seções no documento</w:t>
             </w:r>
           </w:p>
           <w:p>
             <w:pPr>
-              <w:spacing w:before="80" w:after="80" w:line="276" w:lineRule="auto"/>
-              <w:jc w:val="both"/>
+              <w:widowControl w:val="1"/>
+              <w:spacing w:after="240" w:before="240" w:line="276" w:lineRule="auto"/>
+              <w:rPr>
+                <w:rFonts w:ascii="Arial" w:cs="Arial" w:eastAsia="Arial" w:hAnsi="Arial"/>
+                <w:sz w:val="22"/>
+                <w:szCs w:val="22"/>
+              </w:rPr>
             </w:pPr>
             <w:r>
               <w:rPr>
-                <w:rFonts w:ascii="Arial" w:hAnsi="Arial"/>
-                <w:b/>
-                <w:sz w:val="21"/>
-              </w:rPr>
-              <w:t>3. Modernização Temática, Cidadania Digital e Infraestrutura Prática</w:t>
-              <w:br/>
+                <w:rFonts w:ascii="Arial" w:cs="Arial" w:eastAsia="Arial" w:hAnsi="Arial"/>
+                <w:sz w:val="22"/>
+                <w:szCs w:val="22"/>
+                <w:rtl w:val="0"/>
+              </w:rPr>
+              <w:t xml:space="preserve">Em aderência ao novo formulário </w:t>
             </w:r>
             <w:r>
               <w:rPr>
-                <w:rFonts w:ascii="Arial" w:hAnsi="Arial"/>
-                <w:b w:val="0"/>
-                <w:sz w:val="20"/>
-              </w:rPr>
-              <w:t>O perfil do egresso e a matriz técnica foram modernizados com temáticas de vanguarda da área de Gestão e Negócios: (a) Inclusão do Subitem 10.6 dedicado à Proteção de Dados, Segurança da Informação e Cidadania Digital (Lei nº 13.709/2018 - LGPD e Marco Civil da Internet), garantindo a formação ética no tratamento e governança de dados organizacionais; (b) Incorporação de sustentabilidade socioambiental, critérios ESG (Environmental, Social and Governance) e economia circular nos componentes de processos, operações e empreendedorismo; (c) Redimensionamento da unidade de Gestão de Pessoas (80h) voltada à liderança humanizada, inteligência socioemocional e trabalho colaborativo; (d) Formalização no PPC do Laboratório de Inovação, Empreendedorismo e Desenvolvimento Sustentável (LINEDS - Sala B101) como infraestrutura prática institucional para ideação, incubação social e simulações empresariais.</w:t>
+                <w:rFonts w:ascii="Arial" w:cs="Arial" w:eastAsia="Arial" w:hAnsi="Arial"/>
+                <w:sz w:val="22"/>
+                <w:szCs w:val="22"/>
+                <w:rtl w:val="0"/>
+              </w:rPr>
+              <w:t xml:space="preserve">do CEPE </w:t>
+            </w:r>
+            <w:r>
+              <w:rPr>
+                <w:rFonts w:ascii="Arial" w:cs="Arial" w:eastAsia="Arial" w:hAnsi="Arial"/>
+                <w:sz w:val="22"/>
+                <w:szCs w:val="22"/>
+                <w:rtl w:val="0"/>
+              </w:rPr>
+              <w:t xml:space="preserve">para cursos técnicos, houve inserção e atualização dos textos conforme legislações, normativas vigentes e dados socioeconômicos atuais do território.</w:t>
             </w:r>
           </w:p>
           <w:p>
             <w:pPr>
-              <w:spacing w:before="80" w:after="80" w:line="276" w:lineRule="auto"/>
-              <w:jc w:val="both"/>
+              <w:widowControl w:val="1"/>
+              <w:spacing w:after="240" w:before="240" w:line="276" w:lineRule="auto"/>
+              <w:rPr>
+                <w:rFonts w:ascii="Arial" w:cs="Arial" w:eastAsia="Arial" w:hAnsi="Arial"/>
+                <w:sz w:val="22"/>
+                <w:szCs w:val="22"/>
+              </w:rPr>
             </w:pPr>
             <w:r>
               <w:rPr>
-                <w:rFonts w:ascii="Arial" w:hAnsi="Arial"/>
-                <w:b/>
+                <w:rFonts w:ascii="Arial" w:cs="Arial" w:eastAsia="Arial" w:hAnsi="Arial"/>
+                <w:b w:val="1"/>
+                <w:bCs w:val="1"/>
                 <w:sz w:val="21"/>
-              </w:rPr>
-              <w:t>4. Transparência Didática, Acesso Democrático à Bibliografia e Avaliação Emancipatória</w:t>
-              <w:br/>
+                <w:szCs w:val="21"/>
+                <w:rtl w:val="0"/>
+              </w:rPr>
+              <w:t xml:space="preserve">Matriz Curricular e Unidades Curriculares</w:t>
             </w:r>
             <w:r>
               <w:rPr>
-                <w:rFonts w:ascii="Arial" w:hAnsi="Arial"/>
-                <w:b w:val="0"/>
-                <w:sz w:val="20"/>
-              </w:rPr>
-              <w:t>O ementário de todas as 45 unidades curriculares foi padronizado em tópicos claros e objetivos, acompanhado da explicitação de estratégias de metodologias ativas (Aprendizagem Baseada em Problemas - PBL, Estudos de Casos Reais e Simulações Gerenciais). As bibliografias básica e complementar (total de 284 títulos) foram 100% saneadas e normalizadas segundo a norma ABNT NBR 6023:2025, priorizando obras existentes no acervo físico do Câmpus Garopaba e títulos amplamente acessíveis nas plataformas digitais institucionais (Minha Biblioteca e Biblioteca Virtual Pearson), eliminando barreiras financeiras e materiais para o êxito discente. A avaliação da aprendizagem é consolidada como processo formativo, contínuo e emancipatório, com recuperação paralela obrigatória e concomitante ao período letivo, resguardada pelo acompanhamento do Colegiado de Curso e do setor pedagógico.</w:t>
+                <w:rtl w:val="0"/>
+              </w:rPr>
             </w:r>
           </w:p>
           <w:p>
             <w:pPr>
-              <w:spacing w:before="80" w:after="80" w:line="276" w:lineRule="auto"/>
+              <w:widowControl w:val="1"/>
+              <w:spacing w:after="240" w:before="240" w:line="276" w:lineRule="auto"/>
               <w:jc w:val="both"/>
+              <w:rPr>
+                <w:rFonts w:ascii="Arial" w:cs="Arial" w:eastAsia="Arial" w:hAnsi="Arial"/>
+                <w:sz w:val="22"/>
+                <w:szCs w:val="22"/>
+              </w:rPr>
             </w:pPr>
             <w:r>
               <w:rPr>
-                <w:rFonts w:ascii="Arial" w:hAnsi="Arial"/>
-                <w:b/>
-                <w:sz w:val="21"/>
-              </w:rPr>
-              <w:t>Conclusão e Encaminhamento</w:t>
-              <w:br/>
+                <w:rFonts w:ascii="Arial" w:cs="Arial" w:eastAsia="Arial" w:hAnsi="Arial"/>
+                <w:sz w:val="22"/>
+                <w:szCs w:val="22"/>
+                <w:rtl w:val="0"/>
+              </w:rPr>
+              <w:t xml:space="preserve">De forma geral, todas as unidades curriculares foram revisadas e adequadas ao novo modelo de formulário do CEPE. </w:t>
             </w:r>
+          </w:p>
+          <w:p>
+            <w:pPr>
+              <w:widowControl w:val="1"/>
+              <w:spacing w:after="240" w:before="240" w:line="276" w:lineRule="auto"/>
+              <w:jc w:val="both"/>
+              <w:rPr>
+                <w:rFonts w:ascii="Arial" w:cs="Arial" w:eastAsia="Arial" w:hAnsi="Arial"/>
+                <w:sz w:val="22"/>
+                <w:szCs w:val="22"/>
+              </w:rPr>
+            </w:pPr>
             <w:r>
               <w:rPr>
-                <w:rFonts w:ascii="Arial" w:hAnsi="Arial"/>
-                <w:b w:val="0"/>
+                <w:rFonts w:ascii="Arial" w:cs="Arial" w:eastAsia="Arial" w:hAnsi="Arial"/>
+                <w:sz w:val="22"/>
+                <w:szCs w:val="22"/>
+                <w:rtl w:val="0"/>
+              </w:rPr>
+              <w:t xml:space="preserve">No âmbito da Formação Geral, foram realizadas alterações e redistribuição das cargas horárias das UC ao longo dos três anos do curso, em consonância com as Diretrizes para a Organização dos Cursos Técnicos Integrados ao Ensino Médio no IFSC, estabelecidas pela Resolução CONSUP/IFSC nº 142/2025. As alterações também consideraram a estratégia do Câmpus de promover maior equalização e harmonização das cargas horárias entre os componentes curriculares, buscando maior equilíbrio na organização da matriz e no percurso formativo dos estudantes.</w:t>
+            </w:r>
+          </w:p>
+          <w:p>
+            <w:pPr>
+              <w:widowControl w:val="1"/>
+              <w:spacing w:after="240" w:before="240" w:line="276" w:lineRule="auto"/>
+              <w:jc w:val="both"/>
+              <w:rPr>
+                <w:rFonts w:ascii="Arial" w:cs="Arial" w:eastAsia="Arial" w:hAnsi="Arial"/>
+                <w:sz w:val="22"/>
+                <w:szCs w:val="22"/>
+              </w:rPr>
+            </w:pPr>
+            <w:r>
+              <w:rPr>
+                <w:rFonts w:ascii="Arial" w:cs="Arial" w:eastAsia="Arial" w:hAnsi="Arial"/>
+                <w:sz w:val="22"/>
+                <w:szCs w:val="22"/>
+                <w:rtl w:val="0"/>
+              </w:rPr>
+              <w:t xml:space="preserve">Na Formação Técnica e Profissional, a matriz curricular foi reformulada considerando a alteração da carga horária mínima estabelecida pelo Catálogo Nacional de Cursos Técnicos (CNCT) para o Curso Técnico em Administração, de 1.000 para 800 horas. Com a reformulação, a carga horária total do curso passou de 3.140 para 3.120 horas, das quais 840 horas correspondem à Formação Técnica e Profissional e 2.280 horas à Formação Geral. A reorganização, contudo, não se restringiu à adequação ao CNCT/MEC, contemplando também a atualização dos conhecimentos, a maior aderência ao contexto de atuação do Câmpus, o aprimoramento da cadência e do fluxo das unidades curriculares ao longo do curso e o fortalecimento da integração de saberes.</w:t>
+            </w:r>
+          </w:p>
+          <w:p>
+            <w:pPr>
+              <w:widowControl w:val="1"/>
+              <w:spacing w:after="240" w:before="240" w:line="276" w:lineRule="auto"/>
+              <w:jc w:val="both"/>
+              <w:rPr>
+                <w:rFonts w:ascii="Arial" w:cs="Arial" w:eastAsia="Arial" w:hAnsi="Arial"/>
+                <w:sz w:val="22"/>
+                <w:szCs w:val="22"/>
+              </w:rPr>
+            </w:pPr>
+            <w:r>
+              <w:rPr>
+                <w:rFonts w:ascii="Arial" w:cs="Arial" w:eastAsia="Arial" w:hAnsi="Arial"/>
+                <w:sz w:val="22"/>
+                <w:szCs w:val="22"/>
+                <w:rtl w:val="0"/>
+              </w:rPr>
+              <w:t xml:space="preserve">Nesse processo, Fundamentos da Administração passou a denominar-se Introdução à Administração; Administração de Marketing foi reorganizada em Gestão de Marketing I e Gestão de Marketing II; Administração de Pessoas passou a Gestão de Pessoas; Administração Financeira passou a Gestão Financeira; Organização, Sistemas e Métodos foi reformulada como Organização e Processos; Matemática para Administradores passou a Matemática para Administração; e Empreendedorismo foi desdobrado em Empreendedorismo I e Empreendedorismo II. A UC Administração da Qualidade foi extinta como componente curricular autônomo, tendo seus conteúdos incorporados à UC Gestão de Operações e Qualidade. A UC Orientação ao Ensino Técnico foi excluída, considerando-se que seus conteúdos possuem natureza transversal e podem ser desenvolvidos de forma integrada pelas diferentes unidades curriculares do curso. As UCs Comunicação e Linguagem e Espanhol Aplicado também foram excluídas da Formação Técnica e Profissional, uma vez que os conhecimentos a elas relacionados passam a ser contemplados no âmbito da Formação Geral. Foi criada a UC Sociedade e Trabalho, com o propósito de abordar as transformações históricas e contemporâneas do mundo do trabalho e suas relações com a formação e a atuação profissional. Os componentes Projeto Integrador I e Projeto Integrador II foram reformulados como Oficina de Integração I e Oficina de Integração II, respectivamente, passando a compor o Núcleo Politécnico Comum e fortalecendo a articulação entre a Formação Geral e a Formação Técnica e Profissional.</w:t>
+            </w:r>
+          </w:p>
+          <w:p>
+            <w:pPr>
+              <w:widowControl w:val="1"/>
+              <w:spacing w:line="276" w:lineRule="auto"/>
+              <w:jc w:val="both"/>
+              <w:rPr>
+                <w:rFonts w:ascii="Arial" w:cs="Arial" w:eastAsia="Arial" w:hAnsi="Arial"/>
+                <w:sz w:val="22"/>
+                <w:szCs w:val="22"/>
+              </w:rPr>
+            </w:pPr>
+            <w:r>
+              <w:rPr>
+                <w:rtl w:val="0"/>
+              </w:rPr>
+            </w:r>
+          </w:p>
+          <w:p>
+            <w:pPr>
+              <w:spacing w:after="80" w:before="80" w:line="276" w:lineRule="auto"/>
+              <w:jc w:val="both"/>
+              <w:rPr>
+                <w:rFonts w:ascii="Arial" w:cs="Arial" w:eastAsia="Arial" w:hAnsi="Arial"/>
                 <w:sz w:val="20"/>
-              </w:rPr>
-              <w:t>Com base na sólida consistência legal, pedagógica, documental e de infraestrutura apresentada, encaminha-se a presente proposta de alteração de Projeto Pedagógico de Curso à homologação pelo Colegiado do Câmpus Garopaba e, na sequência, à apreciação e deliberação da Câmara de Ensino, Pesquisa e Extensão (CEPE/IFSC).</w:t>
+                <w:szCs w:val="20"/>
+              </w:rPr>
+            </w:pPr>
+            <w:r>
+              <w:rPr>
+                <w:rtl w:val="0"/>
+              </w:rPr>
             </w:r>
           </w:p>
         </w:tc>
@@ -1227,11 +1277,11 @@
         <w:shd w:fill="auto" w:val="clear"/>
         <w:spacing w:after="0" w:before="0" w:line="240" w:lineRule="auto"/>
         <w:ind w:left="0" w:right="0" w:firstLine="0"/>
-        <w:jc w:val="both"/>
-        <w:rPr>
-          <w:rFonts w:ascii="Arial" w:cs="Arial" w:eastAsia="Arial" w:hAnsi="Arial"/>
-          <w:b w:val="1"/>
-          <w:bCs w:val="1"/>
+        <w:jc w:val="right"/>
+        <w:rPr>
+          <w:rFonts w:ascii="Arial" w:cs="Arial" w:eastAsia="Arial" w:hAnsi="Arial"/>
+          <w:b w:val="0"/>
+          <w:bCs w:val="0"/>
           <w:i w:val="0"/>
           <w:iCs w:val="0"/>
           <w:smallCaps w:val="0"/>
@@ -1246,82 +1296,35 @@
       </w:pPr>
       <w:r>
         <w:rPr>
-          <w:rtl w:val="0"/>
-        </w:rPr>
-      </w:r>
-    </w:p>
-    <w:p>
-      <w:pPr>
-        <w:keepNext w:val="0"/>
-        <w:keepLines w:val="0"/>
-        <w:pageBreakBefore w:val="0"/>
-        <w:widowControl w:val="0"/>
-        <w:pBdr>
-          <w:top w:space="0" w:sz="0" w:val="nil"/>
-          <w:left w:space="0" w:sz="0" w:val="nil"/>
-          <w:bottom w:space="0" w:sz="0" w:val="nil"/>
-          <w:right w:space="0" w:sz="0" w:val="nil"/>
-          <w:between w:space="0" w:sz="0" w:val="nil"/>
-        </w:pBdr>
-        <w:shd w:fill="auto" w:val="clear"/>
-        <w:spacing w:after="0" w:before="0" w:line="240" w:lineRule="auto"/>
-        <w:ind w:left="0" w:right="0" w:firstLine="0"/>
-        <w:jc w:val="both"/>
-        <w:rPr>
-          <w:rFonts w:ascii="Arial" w:cs="Arial" w:eastAsia="Arial" w:hAnsi="Arial"/>
-          <w:b w:val="1"/>
-          <w:bCs w:val="1"/>
-          <w:i w:val="0"/>
-          <w:iCs w:val="0"/>
-          <w:smallCaps w:val="0"/>
-          <w:strike w:val="0"/>
-          <w:color w:val="000000"/>
-          <w:sz w:val="24"/>
-          <w:szCs w:val="24"/>
-          <w:u w:val="none"/>
-          <w:shd w:fill="auto" w:val="clear"/>
-          <w:vertAlign w:val="baseline"/>
-        </w:rPr>
-      </w:pPr>
-      <w:r>
-        <w:rPr>
-          <w:rtl w:val="0"/>
-        </w:rPr>
-      </w:r>
-    </w:p>
-    <w:p>
-      <w:pPr>
-        <w:keepNext w:val="0"/>
-        <w:keepLines w:val="0"/>
-        <w:pageBreakBefore w:val="0"/>
-        <w:widowControl w:val="0"/>
-        <w:pBdr>
-          <w:top w:space="0" w:sz="0" w:val="nil"/>
-          <w:left w:space="0" w:sz="0" w:val="nil"/>
-          <w:bottom w:space="0" w:sz="0" w:val="nil"/>
-          <w:right w:space="0" w:sz="0" w:val="nil"/>
-          <w:between w:space="0" w:sz="0" w:val="nil"/>
-        </w:pBdr>
-        <w:shd w:fill="auto" w:val="clear"/>
-        <w:spacing w:after="0" w:before="0" w:line="240" w:lineRule="auto"/>
-        <w:ind w:left="0" w:right="0" w:firstLine="0"/>
-        <w:jc w:val="both"/>
-        <w:rPr>
-          <w:rFonts w:ascii="Arial" w:cs="Arial" w:eastAsia="Arial" w:hAnsi="Arial"/>
-          <w:b w:val="1"/>
-          <w:bCs w:val="1"/>
-          <w:i w:val="0"/>
-          <w:iCs w:val="0"/>
-          <w:smallCaps w:val="0"/>
-          <w:strike w:val="0"/>
-          <w:color w:val="000000"/>
-          <w:sz w:val="24"/>
-          <w:szCs w:val="24"/>
-          <w:u w:val="none"/>
-          <w:shd w:fill="auto" w:val="clear"/>
-          <w:vertAlign w:val="baseline"/>
-        </w:rPr>
-      </w:pPr>
+          <w:rFonts w:ascii="Arial" w:cs="Arial" w:eastAsia="Arial" w:hAnsi="Arial"/>
+          <w:b w:val="0"/>
+          <w:bCs w:val="0"/>
+          <w:sz w:val="22"/>
+          <w:szCs w:val="22"/>
+          <w:rtl w:val="0"/>
+        </w:rPr>
+        <w:t xml:space="preserve">Garopaba (SC), </w:t>
+      </w:r>
+      <w:r>
+        <w:rPr>
+          <w:rFonts w:ascii="Arial" w:cs="Arial" w:eastAsia="Arial" w:hAnsi="Arial"/>
+          <w:sz w:val="22"/>
+          <w:szCs w:val="22"/>
+          <w:rtl w:val="0"/>
+        </w:rPr>
+        <w:t xml:space="preserve">11</w:t>
+      </w:r>
+      <w:r>
+        <w:rPr>
+          <w:rFonts w:ascii="Arial" w:cs="Arial" w:eastAsia="Arial" w:hAnsi="Arial"/>
+          <w:b w:val="0"/>
+          <w:bCs w:val="0"/>
+          <w:sz w:val="22"/>
+          <w:szCs w:val="22"/>
+          <w:rtl w:val="0"/>
+        </w:rPr>
+        <w:t xml:space="preserve"> de setembro de 2026.</w:t>
+      </w:r>
       <w:r>
         <w:rPr>
           <w:rtl w:val="0"/>
@@ -1363,11 +1366,8 @@
       </w:pPr>
       <w:r>
         <w:rPr>
-          <w:rFonts w:ascii="Arial" w:hAnsi="Arial"/>
-          <w:b w:val="0"/>
-          <w:sz w:val="22"/>
-        </w:rPr>
-        <w:t>Garopaba (SC), 09 de setembro de 2026.</w:t>
+          <w:rtl w:val="0"/>
+        </w:rPr>
       </w:r>
     </w:p>
     <w:p>
@@ -1389,18 +1389,6 @@
         <w:jc w:val="right"/>
         <w:rPr>
           <w:rFonts w:ascii="Arial" w:cs="Arial" w:eastAsia="Arial" w:hAnsi="Arial"/>
-          <w:b w:val="0"/>
-          <w:bCs w:val="0"/>
-          <w:i w:val="0"/>
-          <w:iCs w:val="0"/>
-          <w:smallCaps w:val="0"/>
-          <w:strike w:val="0"/>
-          <w:color w:val="000000"/>
-          <w:sz w:val="24"/>
-          <w:szCs w:val="24"/>
-          <w:u w:val="none"/>
-          <w:shd w:fill="auto" w:val="clear"/>
-          <w:vertAlign w:val="baseline"/>
         </w:rPr>
       </w:pPr>
       <w:r>
@@ -1428,18 +1416,33 @@
         <w:jc w:val="right"/>
         <w:rPr>
           <w:rFonts w:ascii="Arial" w:cs="Arial" w:eastAsia="Arial" w:hAnsi="Arial"/>
-          <w:b w:val="0"/>
-          <w:bCs w:val="0"/>
-          <w:i w:val="0"/>
-          <w:iCs w:val="0"/>
-          <w:smallCaps w:val="0"/>
-          <w:strike w:val="0"/>
-          <w:color w:val="000000"/>
-          <w:sz w:val="24"/>
-          <w:szCs w:val="24"/>
-          <w:u w:val="none"/>
-          <w:shd w:fill="auto" w:val="clear"/>
-          <w:vertAlign w:val="baseline"/>
+        </w:rPr>
+      </w:pPr>
+      <w:r>
+        <w:rPr>
+          <w:rtl w:val="0"/>
+        </w:rPr>
+      </w:r>
+    </w:p>
+    <w:p>
+      <w:pPr>
+        <w:keepNext w:val="0"/>
+        <w:keepLines w:val="0"/>
+        <w:pageBreakBefore w:val="0"/>
+        <w:widowControl w:val="0"/>
+        <w:pBdr>
+          <w:top w:space="0" w:sz="0" w:val="nil"/>
+          <w:left w:space="0" w:sz="0" w:val="nil"/>
+          <w:bottom w:space="0" w:sz="0" w:val="nil"/>
+          <w:right w:space="0" w:sz="0" w:val="nil"/>
+          <w:between w:space="0" w:sz="0" w:val="nil"/>
+        </w:pBdr>
+        <w:shd w:fill="auto" w:val="clear"/>
+        <w:spacing w:after="0" w:before="0" w:line="240" w:lineRule="auto"/>
+        <w:ind w:left="0" w:right="0" w:firstLine="0"/>
+        <w:jc w:val="right"/>
+        <w:rPr>
+          <w:rFonts w:ascii="Arial" w:cs="Arial" w:eastAsia="Arial" w:hAnsi="Arial"/>
         </w:rPr>
       </w:pPr>
       <w:r>
@@ -1483,12 +1486,19 @@
       </w:pPr>
       <w:r>
         <w:rPr>
-          <w:rFonts w:ascii="Arial" w:hAnsi="Arial"/>
+          <w:rFonts w:ascii="Arial" w:cs="Arial" w:eastAsia="Arial" w:hAnsi="Arial"/>
           <w:sz w:val="22"/>
-        </w:rPr>
-        <w:t>_____________________________________________________</w:t>
-        <w:br/>
-        <w:t>Assinatura da Direção do Campus Garopaba — IFSC</w:t>
+          <w:szCs w:val="22"/>
+          <w:rtl w:val="0"/>
+        </w:rPr>
+        <w:t xml:space="preserve">_____________________________________________________</w:t>
+        <w:br w:type="textWrapping"/>
+        <w:t xml:space="preserve">Assinatura da Direção do Campus Garopaba — IFSC</w:t>
+      </w:r>
+      <w:r>
+        <w:rPr>
+          <w:rtl w:val="0"/>
+        </w:rPr>
       </w:r>
     </w:p>
     <w:sectPr>
@@ -1506,7 +1516,6 @@
     <w:pPr>
       <w:keepNext w:val="0"/>
       <w:keepLines w:val="0"/>
-      <w:pageBreakBefore w:val="0"/>
       <w:widowControl w:val="0"/>
       <w:pBdr>
         <w:top w:space="0" w:sz="0" w:val="nil"/>
@@ -1563,7 +1572,6 @@
     <w:pPr>
       <w:keepNext w:val="0"/>
       <w:keepLines w:val="0"/>
-      <w:pageBreakBefore w:val="0"/>
       <w:widowControl w:val="0"/>
       <w:pBdr>
         <w:top w:space="0" w:sz="0" w:val="nil"/>
@@ -1620,7 +1628,6 @@
     <w:pPr>
       <w:keepNext w:val="0"/>
       <w:keepLines w:val="0"/>
-      <w:pageBreakBefore w:val="0"/>
       <w:widowControl w:val="0"/>
       <w:pBdr>
         <w:top w:space="0" w:sz="0" w:val="nil"/>
@@ -1682,7 +1689,6 @@
     <w:pPr>
       <w:keepNext w:val="0"/>
       <w:keepLines w:val="0"/>
-      <w:pageBreakBefore w:val="0"/>
       <w:widowControl w:val="0"/>
       <w:pBdr>
         <w:top w:space="0" w:sz="0" w:val="nil"/>
@@ -1728,12 +1734,12 @@
             <wp:posOffset>0</wp:posOffset>
           </wp:positionH>
           <wp:positionV relativeFrom="paragraph">
-            <wp:posOffset>-304799</wp:posOffset>
+            <wp:posOffset>-304798</wp:posOffset>
           </wp:positionV>
           <wp:extent cx="6120130" cy="663575"/>
           <wp:effectExtent b="0" l="0" r="0" t="0"/>
           <wp:wrapTopAndBottom distB="0" distT="0"/>
-          <wp:docPr id="1" name="image1.jpg"/>
+          <wp:docPr id="2" name="image1.jpg"/>
           <a:graphic>
             <a:graphicData uri="http://schemas.openxmlformats.org/drawingml/2006/picture">
               <pic:pic>
@@ -1777,7 +1783,7 @@
       <w:rPr>
         <w:sz w:val="24"/>
         <w:szCs w:val="24"/>
-        <w:lang w:val="pt-BR"/>
+        <w:lang w:val="pt_BR"/>
       </w:rPr>
     </w:rPrDefault>
     <w:pPrDefault>
@@ -1913,6 +1919,46 @@
       <w:sz w:val="28"/>
       <w:szCs w:val="28"/>
     </w:rPr>
+  </w:style>
+  <w:style w:type="table" w:styleId="TableNormal" w:default="1">
+    <w:name w:val="TableNormal"/>
+    <w:tblPr>
+      <w:tblCellMar>
+        <w:top w:w="100.0" w:type="dxa"/>
+        <w:left w:w="100.0" w:type="dxa"/>
+        <w:bottom w:w="100.0" w:type="dxa"/>
+        <w:right w:w="100.0" w:type="dxa"/>
+      </w:tblCellMar>
+    </w:tblPr>
+  </w:style>
+  <w:style w:type="paragraph" w:styleId="Normal" w:default="1">
+    <w:name w:val="normal"/>
+  </w:style>
+  <w:style w:type="table" w:styleId="Table1">
+    <w:basedOn w:val="TableNormal"/>
+    <w:tblPr>
+      <w:tblStyleRowBandSize w:val="1"/>
+      <w:tblStyleColBandSize w:val="1"/>
+      <w:tblCellMar>
+        <w:top w:w="55.0" w:type="dxa"/>
+        <w:left w:w="54.0" w:type="dxa"/>
+        <w:bottom w:w="55.0" w:type="dxa"/>
+        <w:right w:w="55.0" w:type="dxa"/>
+      </w:tblCellMar>
+    </w:tblPr>
+  </w:style>
+  <w:style w:type="table" w:styleId="Table2">
+    <w:basedOn w:val="TableNormal"/>
+    <w:tblPr>
+      <w:tblStyleRowBandSize w:val="1"/>
+      <w:tblStyleColBandSize w:val="1"/>
+      <w:tblCellMar>
+        <w:top w:w="55.0" w:type="dxa"/>
+        <w:left w:w="54.0" w:type="dxa"/>
+        <w:bottom w:w="55.0" w:type="dxa"/>
+        <w:right w:w="55.0" w:type="dxa"/>
+      </w:tblCellMar>
+    </w:tblPr>
   </w:style>
   <w:style w:type="paragraph" w:styleId="Subtitle">
     <w:name w:val="Subtitle"/>
@@ -2278,4 +2324,19 @@
   </a:objectDefaults>
   <a:extraClrSchemeLst/>
 </a:theme>
+</file>
+
+<file path=customXML/item1.xml><?xml version="1.0" encoding="utf-8"?>
+<go:gDocsCustomXmlDataStorage xmlns:go="http://customooxmlschemas.google.com/" xmlns:r="http://schemas.openxmlformats.org/officeDocument/2006/relationships" uri="GoogleDocsCustomDataVersion2">
+  <go:docsCustomData xmlns:go="http://customooxmlschemas.google.com/" roundtripDataSignature="AMtx7mgVg/nVJPW3rho1AmfV6oLQdyRmsQ==">CgMxLjA4AHIhMVVocDB4VjZmdTFxZGtVbXFsdUhIMTZTRWRmNXF3N1B4</go:docsCustomData>
+</go:gDocsCustomXmlDataStorage>
+</file>
+
+<file path=customXML/itemProps1.xml><?xml version="1.0" encoding="utf-8"?>
+<ds:datastoreItem xmlns:ds="http://schemas.openxmlformats.org/officeDocument/2006/customXml" ds:itemID="{11111111-1234-1234-1234-123412341234}">
+  <ds:schemaRefs>
+    <ds:schemaRef ds:uri="http://schemas.openxmlformats.org/officeDocument/2006/relationships"/>
+    <ds:schemaRef ds:uri="http://customooxmlschemas.google.com/"/>
+  </ds:schemaRefs>
+</ds:datastoreItem>
 </file>
</xml_diff>